<commit_message>
feat(resume): senior-PM rewrite + unlisted VC variant
Retargets the résumé at senior PM roles in crypto derivatives and adds
content/resume-vc.md at /resume/vc (noindex). Build scripts take
RESUME_VARIANT and refuse to write public/ while [[TODO]] slots remain.

Co-Authored-By: Claude Opus 5.5 <noreply@anthropic.com>
</commit_message>
<xml_diff>
--- a/public/charandeep-kapoor-resume.docx
+++ b/public/charandeep-kapoor-resume.docx
@@ -28,7 +28,7 @@
           <w:sz w:val="22"/>
           <w:szCs w:val="22"/>
         </w:rPr>
-        <w:t xml:space="preserve">AI Product Manager &amp; Engineer</w:t>
+        <w:t xml:space="preserve">Senior Product Manager · Crypto Derivatives &amp; AI</w:t>
       </w:r>
     </w:p>
     <w:p>
@@ -72,7 +72,7 @@
           <w:sz w:val="19"/>
           <w:szCs w:val="19"/>
         </w:rPr>
-        <w:t xml:space="preserve">AI Product Manager at Delta Exchange, India's largest crypto derivatives exchange, where I own the LLM surface across trading, signals and research.</w:t>
+        <w:t xml:space="preserve">Product manager for crypto derivatives and AI. I own the LLM surface at Delta Exchange, India's largest crypto derivatives exchange, and have shipped AI signal products with 40k+ users.</w:t>
       </w:r>
     </w:p>
     <w:p>
@@ -130,7 +130,7 @@
           <w:sz w:val="19"/>
           <w:szCs w:val="19"/>
         </w:rPr>
-        <w:t xml:space="preserve">Live Claude signals on Delta crypto perpetuals, 40k+ users. 15-minute regime-aware cycle, 8 markets, reduce-only stops and a loss breaker. Paid Meta and Google campaigns, tracked in PostHog.</w:t>
+        <w:t xml:space="preserve">Live Claude signals on Delta perpetuals, 40k+ users from paid Meta and Google. 15-minute cycle, 8 markets, reduce-only stops, loss breaker.</w:t>
       </w:r>
     </w:p>
     <w:p>
@@ -370,7 +370,7 @@
           <w:sz w:val="19"/>
           <w:szCs w:val="19"/>
         </w:rPr>
-        <w:t xml:space="preserve">Own the AI and LLM surface across the trading, signals and research stack.</w:t>
+        <w:t xml:space="preserve">Joined via acqui-hire after Zerodha and Dhan held acquisition talks.</w:t>
       </w:r>
     </w:p>
     <w:p>
@@ -389,7 +389,7 @@
           <w:sz w:val="19"/>
           <w:szCs w:val="19"/>
         </w:rPr>
-        <w:t xml:space="preserve">Built the Delta Exchange MCP server, market and trading tools, and led the docs and marketing rollout.</w:t>
+        <w:t xml:space="preserve">Shipped the official Delta Exchange MCP server (40 tools, market data to guarded execution) and ran its launch: docs, GTM microsite, 90-day plan.</w:t>
       </w:r>
     </w:p>
     <w:p>
@@ -408,7 +408,7 @@
           <w:sz w:val="19"/>
           <w:szCs w:val="19"/>
         </w:rPr>
-        <w:t xml:space="preserve">Delta Support Audit: nightly RAG pass catching drift in support articles.</w:t>
+        <w:t xml:space="preserve">Support Audit: RAG pass over 217 articles, 291 drift findings, 222 fixed.</w:t>
       </w:r>
     </w:p>
     <w:p>
@@ -483,7 +483,7 @@
           <w:sz w:val="19"/>
           <w:szCs w:val="19"/>
         </w:rPr>
-        <w:t xml:space="preserve">Bootstrapped a decentralized, liquidation-free derivatives house.</w:t>
+        <w:t xml:space="preserve">Bootstrapped a liquidation-free exchange: perps, options, prediction markets.</w:t>
       </w:r>
     </w:p>
     <w:p>
@@ -853,7 +853,7 @@
           <w:sz w:val="19"/>
           <w:szCs w:val="19"/>
         </w:rPr>
-        <w:t xml:space="preserve">0-to-1 delivery, Team leadership</w:t>
+        <w:t xml:space="preserve">0-to-1 delivery, PRDs, funnel metrics &amp; GTM, Team leadership</w:t>
       </w:r>
     </w:p>
     <w:p>

</xml_diff>